<commit_message>
agrego introducción teórica a la guia alumnos
</commit_message>
<xml_diff>
--- a/docs/guia_docentes.docx
+++ b/docs/guia_docentes.docx
@@ -41,6 +41,15 @@
       <w:r>
         <w:rPr/>
         <w:t>Recorrer el flujo completo de un problema de Machine Learning aplicado a un problema biológico real: datos → representación numérica → modelo → evaluación → discusión. La idea central que atraviesa todo el práctico es que el desempeño de un sistema de ML depende tanto de la representación elegida como del algoritmo — y, como van a ver, en este caso particular depende mucho más de lo primero que de lo segundo.</w:t>
+      </w:r>
+    </w:p>
+    <w:p>
+      <w:pPr>
+        <w:pStyle w:val="Normal"/>
+        <w:rPr/>
+      </w:pPr>
+      <w:r>
+        <w:t>La guía de alumnos ahora incluye, para cada bloque, una breve introducción a los conceptos necesarios y preguntas guía. Esta guía de docentes funciona como referencia de las respuestas esperadas y de los mensajes que conviene dejar claros al cierre de cada bloque.</w:t>
       </w:r>
     </w:p>
     <w:p>
@@ -2408,6 +2417,80 @@
       </w:pPr>
       <w:r>
         <w:t>¿Y ESM-2? Implementado en data/04_esm2_embeddings.py y en el notebook notebooks/esm2_embeddings_colab.ipynb. Embeddings congelados + regresión logística, corriendo en CPU (Colab): balanced accuracy 0.853 con el modelo de 8M, por encima de las features hechas a mano (0.816). No hace falta un modelo más grande.</w:t>
+      </w:r>
+    </w:p>
+    <w:p>
+      <w:pPr>
+        <w:pStyle w:val="Heading1"/>
+        <w:rPr/>
+      </w:pPr>
+      <w:r>
+        <w:t>Mensajes para llevarse (cierre)</w:t>
+      </w:r>
+    </w:p>
+    <w:p>
+      <w:pPr>
+        <w:pStyle w:val="ListParagraph"/>
+        <w:numPr>
+          <w:ilvl w:val="0"/>
+          <w:numId w:val="5"/>
+        </w:numPr>
+        <w:rPr/>
+      </w:pPr>
+      <w:r>
+        <w:t>La forma de representar los datos importa tanto o más que el algoritmo elegido.</w:t>
+      </w:r>
+    </w:p>
+    <w:p>
+      <w:pPr>
+        <w:pStyle w:val="ListParagraph"/>
+        <w:numPr>
+          <w:ilvl w:val="0"/>
+          <w:numId w:val="5"/>
+        </w:numPr>
+        <w:rPr/>
+      </w:pPr>
+      <w:r>
+        <w:t>Más features no es mejor: con pocas muestras, agregar variables puede empeorar el resultado (overfitting).</w:t>
+      </w:r>
+    </w:p>
+    <w:p>
+      <w:pPr>
+        <w:pStyle w:val="ListParagraph"/>
+        <w:numPr>
+          <w:ilvl w:val="0"/>
+          <w:numId w:val="5"/>
+        </w:numPr>
+        <w:rPr/>
+      </w:pPr>
+      <w:r>
+        <w:t>Lo que movió la aguja fue incorporar biología conocida y posicional (TMD, NLS, péptido señal), no sumar más conteos.</w:t>
+      </w:r>
+    </w:p>
+    <w:p>
+      <w:pPr>
+        <w:pStyle w:val="ListParagraph"/>
+        <w:numPr>
+          <w:ilvl w:val="0"/>
+          <w:numId w:val="5"/>
+        </w:numPr>
+        <w:rPr/>
+      </w:pPr>
+      <w:r>
+        <w:t>Evaluar siempre en datos que el modelo no vio, y mirar F1 y la Confusion Matrix, no sólo accuracy.</w:t>
+      </w:r>
+    </w:p>
+    <w:p>
+      <w:pPr>
+        <w:pStyle w:val="ListParagraph"/>
+        <w:numPr>
+          <w:ilvl w:val="0"/>
+          <w:numId w:val="5"/>
+        </w:numPr>
+        <w:rPr/>
+      </w:pPr>
+      <w:r>
+        <w:t>Los modelos de lenguaje de proteínas (ESM-2) aprenden la representación solos y hoy son el estado del arte; la ingeniería de features sigue siendo válida, pero ya no es el único camino.</w:t>
       </w:r>
     </w:p>
     <w:p>

</xml_diff>